<commit_message>
Regenerate PDF/DOCX exports for the F.3 Total OPEX fix
Rebuilds all appendix PDFs and the merged DEQUAD_UKES_FULL_SUBMISSION.pdf
via build_ukes_pdf.py, and the Business Plan/Full Submission DOCX
exports via pandoc.

Co-Authored-By: Claude Sonnet 5 <noreply@anthropic.com>
</commit_message>
<xml_diff>
--- a/visa_appendices/docx/DEQUAD_UKES_Business_Plan.docx
+++ b/visa_appendices/docx/DEQUAD_UKES_Business_Plan.docx
@@ -16972,43 +16972,43 @@
               <w:pStyle w:val="Compact"/>
             </w:pPr>
             <w:r>
-              <w:t xml:space="preserve">Fixed assets capex</w:t>
-            </w:r>
-          </w:p>
-        </w:tc>
-        <w:tc>
-          <w:tcPr/>
-          <w:p>
-            <w:pPr>
-              <w:pStyle w:val="Compact"/>
-              <w:jc w:val="right"/>
-            </w:pPr>
-            <w:r>
-              <w:t xml:space="preserve">£600</w:t>
-            </w:r>
-          </w:p>
-        </w:tc>
-        <w:tc>
-          <w:tcPr/>
-          <w:p>
-            <w:pPr>
-              <w:pStyle w:val="Compact"/>
-              <w:jc w:val="right"/>
-            </w:pPr>
-            <w:r>
-              <w:t xml:space="preserve">£600</w:t>
-            </w:r>
-          </w:p>
-        </w:tc>
-        <w:tc>
-          <w:tcPr/>
-          <w:p>
-            <w:pPr>
-              <w:pStyle w:val="Compact"/>
-              <w:jc w:val="right"/>
-            </w:pPr>
-            <w:r>
-              <w:t xml:space="preserve">£1,200</w:t>
+              <w:t xml:space="preserve">Depreciation &amp; amortisation</w:t>
+            </w:r>
+          </w:p>
+        </w:tc>
+        <w:tc>
+          <w:tcPr/>
+          <w:p>
+            <w:pPr>
+              <w:pStyle w:val="Compact"/>
+              <w:jc w:val="right"/>
+            </w:pPr>
+            <w:r>
+              <w:t xml:space="preserve">£150</w:t>
+            </w:r>
+          </w:p>
+        </w:tc>
+        <w:tc>
+          <w:tcPr/>
+          <w:p>
+            <w:pPr>
+              <w:pStyle w:val="Compact"/>
+              <w:jc w:val="right"/>
+            </w:pPr>
+            <w:r>
+              <w:t xml:space="preserve">£400</w:t>
+            </w:r>
+          </w:p>
+        </w:tc>
+        <w:tc>
+          <w:tcPr/>
+          <w:p>
+            <w:pPr>
+              <w:pStyle w:val="Compact"/>
+              <w:jc w:val="right"/>
+            </w:pPr>
+            <w:r>
+              <w:t xml:space="preserve">£700</w:t>
             </w:r>
           </w:p>
         </w:tc>
@@ -17041,39 +17041,39 @@
                 <w:b/>
                 <w:bCs/>
               </w:rPr>
-              <w:t xml:space="preserve">£3,280</w:t>
-            </w:r>
-          </w:p>
-        </w:tc>
-        <w:tc>
-          <w:tcPr/>
-          <w:p>
-            <w:pPr>
-              <w:pStyle w:val="Compact"/>
-              <w:jc w:val="right"/>
-            </w:pPr>
-            <w:r>
-              <w:rPr>
-                <w:b/>
-                <w:bCs/>
-              </w:rPr>
-              <w:t xml:space="preserve">£6,600</w:t>
-            </w:r>
-          </w:p>
-        </w:tc>
-        <w:tc>
-          <w:tcPr/>
-          <w:p>
-            <w:pPr>
-              <w:pStyle w:val="Compact"/>
-              <w:jc w:val="right"/>
-            </w:pPr>
-            <w:r>
-              <w:rPr>
-                <w:b/>
-                <w:bCs/>
-              </w:rPr>
-              <w:t xml:space="preserve">£33,200</w:t>
+              <w:t xml:space="preserve">£2,830</w:t>
+            </w:r>
+          </w:p>
+        </w:tc>
+        <w:tc>
+          <w:tcPr/>
+          <w:p>
+            <w:pPr>
+              <w:pStyle w:val="Compact"/>
+              <w:jc w:val="right"/>
+            </w:pPr>
+            <w:r>
+              <w:rPr>
+                <w:b/>
+                <w:bCs/>
+              </w:rPr>
+              <w:t xml:space="preserve">£6,400</w:t>
+            </w:r>
+          </w:p>
+        </w:tc>
+        <w:tc>
+          <w:tcPr/>
+          <w:p>
+            <w:pPr>
+              <w:pStyle w:val="Compact"/>
+              <w:jc w:val="right"/>
+            </w:pPr>
+            <w:r>
+              <w:rPr>
+                <w:b/>
+                <w:bCs/>
+              </w:rPr>
+              <w:t xml:space="preserve">£32,700</w:t>
             </w:r>
           </w:p>
         </w:tc>
@@ -17108,16 +17108,6 @@
               </w:rPr>
               <w:t xml:space="preserve">(£3,630)</w:t>
             </w:r>
-            <w:r>
-              <w:t xml:space="preserve"> </w:t>
-            </w:r>
-            <w:r>
-              <w:rPr>
-                <w:i/>
-                <w:iCs/>
-              </w:rPr>
-              <w:t xml:space="preserve">(incl. depreciation, see §13)</w:t>
-            </w:r>
           </w:p>
         </w:tc>
         <w:tc>
@@ -17154,6 +17144,18 @@
         </w:tc>
       </w:tr>
     </w:tbl>
+    <w:p>
+      <w:pPr>
+        <w:pStyle w:val="BodyText"/>
+      </w:pPr>
+      <w:r>
+        <w:rPr>
+          <w:i/>
+          <w:iCs/>
+        </w:rPr>
+        <w:t xml:space="preserve">Fixed assets capex (£600 / £600 / £1,200) is a balance-sheet item, capitalised and depreciated over its useful life rather than expensed in full — it appears as a cash outflow in the Cash Flow Forecast (§F.4) but not in Total OPEX above, which instead includes the depreciation charge.</w:t>
+      </w:r>
+    </w:p>
     <w:p>
       <w:r>
         <w:pict>

</xml_diff>